<commit_message>
Update 83137730 Philip McGaw - Professional Review.docx
</commit_message>
<xml_diff>
--- a/IET/83137730 Philip McGaw - Professional Review.docx
+++ b/IET/83137730 Philip McGaw - Professional Review.docx
@@ -1401,7 +1401,21 @@
           <w:sz w:val="24"/>
           <w:szCs w:val="24"/>
         </w:rPr>
-        <w:t xml:space="preserve">where carrying on from the experience gained at JLR, and CASS I hold the position as the EMC Engineer responsible for electrical component validation, My initial tasks are to write a number of internal compliance standards covering EMC, </w:t>
+        <w:t xml:space="preserve">where carrying on from the experience gained at JLR, and CASS I hold the position as the EMC Engineer responsible for electrical component validation, My initial tasks are to write </w:t>
+      </w:r>
+      <w:r>
+        <w:rPr>
+          <w:sz w:val="24"/>
+          <w:szCs w:val="24"/>
+        </w:rPr>
+        <w:t>several</w:t>
+      </w:r>
+      <w:r>
+        <w:rPr>
+          <w:sz w:val="24"/>
+          <w:szCs w:val="24"/>
+        </w:rPr>
+        <w:t xml:space="preserve"> internal compliance standards covering EMC, </w:t>
       </w:r>
       <w:r>
         <w:rPr>

</xml_diff>